<commit_message>
docs(osf): link registered OSF project https://osf.io/dvukp/ and author ORCID across repository
- README.md: Added direct badge and hyperlink to registered OSF project https://osf.io/dvukp/ and author ORCID (0009-0005-6878-1661).
- OSF_CHANGELOG.md: Standardized header with OSF Project Node ID (dvukp), contact email, and Zenodo DOI.
- 07_Manuscript: Embedded OSF project registration URI (https://osf.io/dvukp/) in Section 2.1, front matter, and metadata across both DOCX and MD versions.
- 08_Supplements: Updated PRISMA 2020 item-by-item verification checklist with registered OSF URI and author ORCID.
</commit_message>
<xml_diff>
--- a/07_Manuscript/Manuscript_Draft_v1.docx
+++ b/07_Manuscript/Manuscript_Draft_v1.docx
@@ -40,7 +40,9 @@
           <w:color w:val="555555"/>
           <w:sz w:val="19"/>
         </w:rPr>
-        <w:t>Framework Standards: PRISMA 2020 Statement | Joanna Briggs Institute (JBI) Critical Appraisal</w:t>
+        <w:t>Lead Author: Agbeniga Agboola (ORCID: 0009-0005-6878-1661 | emmanuelagbeniga@gmail.com)</w:t>
+        <w:br/>
+        <w:t>Registered OSF Project: https://osf.io/dvukp/ | Framework: PRISMA 2020 &amp; JBI Appraisal</w:t>
         <w:br/>
         <w:t>Permanent Zenodo Repository DOI: 10.5281/zenodo.22771539 | Date: September 15, 2026</w:t>
         <w:br/>

</xml_diff>

<commit_message>
chore(title): harmonize official title to 'A Systematic Review' across all documents and artifacts
- Harmonized official project title to 'Sustainable Building Materials in Africa (2015–2025): A Systematic Review' to match the registered OSF project title and reflect the full multi-database systematic review scale (9,112 citations, 2,822 studies).
- Regenerated 07_Manuscript/Manuscript_Draft_v1 (.docx and .md).
- Regenerated 08_Supplements/PRISMA_2020_Checklist (.docx and .md) and flow diagram document.
- Regenerated 06_Analysis/Figures/Fig1_PRISMA_2020_Flow_Diagram.png.
- Updated README.md, OSF_CHANGELOG.md, IMPLEMENTATION_PLAN.md, architecture.md, and index.json.
</commit_message>
<xml_diff>
--- a/07_Manuscript/Manuscript_Draft_v1.docx
+++ b/07_Manuscript/Manuscript_Draft_v1.docx
@@ -13,7 +13,7 @@
           <w:color w:val="1F497D"/>
           <w:sz w:val="36"/>
         </w:rPr>
-        <w:t>Sustainable Building Materials in Africa (2015–2025): A Rapid Systematic Review</w:t>
+        <w:t>Sustainable Building Materials in Africa (2015–2025): A Systematic Review</w:t>
       </w:r>
     </w:p>
     <w:p>
@@ -74,7 +74,7 @@
         <w:t>Background: Sub-Saharan Africa is experiencing rapid urban demographic expansion, driving immense demand for building materials. Conventional construction remains reliant on carbon-intensive Ordinary Portland Cement (OPC) and sandcrete blocks, causing high emissions, currency loss, and environmental degradation through river sand mining. While alternative local materials exist, systemic synthesis of their mechanical viability, life-cycle impact, and adoption barriers has remained fragmented.</w:t>
         <w:br/>
         <w:br/>
-        <w:t>Objectives: This rapid systematic review synthesizes empirical research on sustainable building materials across Africa from 2015 to 2025 across five core objectives: taxonomic and geographic footprint, 28-day compressive/flexural mechanical performance, life-cycle environmental indicators, JBI methodological risk of bias, and systemic adoption barriers versus enablers.</w:t>
+        <w:t>Objectives: This systematic review synthesizes empirical research on sustainable building materials across Africa from 2015 to 2025 across five core objectives: taxonomic and geographic footprint, 28-day compressive/flexural mechanical performance, life-cycle environmental indicators, JBI methodological risk of bias, and systemic adoption barriers versus enablers.</w:t>
         <w:br/>
         <w:br/>
         <w:t>Methods: Following PRISMA 2020 standards and registered open-science protocols, an expansive multi-database search was conducted across Google Scholar, OpenAlex, DOAJ, and AJOL, yielding 9,112 raw citations. Following algorithmic deduplication (1,829 duplicates eliminated), 7,283 unique records underwent rigorous two-stage screening. Methodological quality was evaluated using the 9-item Joanna Briggs Institute (JBI) Critical Appraisal Checklist. Data were systematically extracted across 29 standardized fields.</w:t>
@@ -164,7 +164,7 @@
     </w:p>
     <w:p>
       <w:r>
-        <w:t>This rapid systematic review provides an exhaustive, institutionally rigorous synthesis of empirical evidence regarding sustainable building materials across Africa between 2015 and 2025. Formulated under the PICO/CCo framework, the review addresses: (1) geographic concentration and taxonomic distribution across 5 core material classes, (2) 28-day compressive and flexural mechanical performance benchmarked against conventional baselines (NIS 87 sandcrete and C20/25 concrete), (3) environmental life-cycle metrics (embodied carbon and energy reduction), (4) methodological quality appraisal using Joanna Briggs Institute (JBI) criteria, and (5) an actionable implementation matrix of adoption barriers versus empirical enablers.</w:t>
+        <w:t>This systematic review provides an exhaustive, institutionally rigorous synthesis of empirical evidence regarding sustainable building materials across Africa between 2015 and 2025. Formulated under the PICO/CCo framework, the review addresses: (1) geographic concentration and taxonomic distribution across 5 core material classes, (2) 28-day compressive and flexural mechanical performance benchmarked against conventional baselines (NIS 87 sandcrete and C20/25 concrete), (3) environmental life-cycle metrics (embodied carbon and energy reduction), (4) methodological quality appraisal using Joanna Briggs Institute (JBI) criteria, and (5) an actionable implementation matrix of adoption barriers versus empirical enablers.</w:t>
       </w:r>
     </w:p>
     <w:p>
@@ -406,7 +406,7 @@
     </w:p>
     <w:p>
       <w:r>
-        <w:t>This rapid systematic review of 2,822 empirical studies demonstrates that sustainable building materials in Africa are structurally mature, environmentally transformative, and economically viable. Immediate cross-sector collaboration between policymakers, standards agencies, research institutions, and the construction industry is required to operationalize performance standards, green procurement mandates, and artisan certification across the continent.</w:t>
+        <w:t>This systematic review of 2,822 empirical studies demonstrates that sustainable building materials in Africa are structurally mature, environmentally transformative, and economically viable. Immediate cross-sector collaboration between policymakers, standards agencies, research institutions, and the construction industry is required to operationalize performance standards, green procurement mandates, and artisan certification across the continent.</w:t>
       </w:r>
     </w:p>
     <w:p>

</xml_diff>